<commit_message>
Fixed mistake in date
</commit_message>
<xml_diff>
--- a/WeeklyReport/WeeklyProjectLog-02-10-24.docx
+++ b/WeeklyReport/WeeklyProjectLog-02-10-24.docx
@@ -213,7 +213,31 @@
                 <w:sz w:val="24"/>
                 <w:szCs w:val="24"/>
               </w:rPr>
-              <w:t>25-09-24</w:t>
+              <w:t>02</w:t>
+            </w:r>
+            <w:r>
+              <w:rPr>
+                <w:rFonts w:asciiTheme="majorHAnsi" w:eastAsia="Times New Roman" w:hAnsiTheme="majorHAnsi" w:cstheme="majorHAnsi"/>
+                <w:sz w:val="24"/>
+                <w:szCs w:val="24"/>
+              </w:rPr>
+              <w:t>-</w:t>
+            </w:r>
+            <w:r>
+              <w:rPr>
+                <w:rFonts w:asciiTheme="majorHAnsi" w:eastAsia="Times New Roman" w:hAnsiTheme="majorHAnsi" w:cstheme="majorHAnsi"/>
+                <w:sz w:val="24"/>
+                <w:szCs w:val="24"/>
+              </w:rPr>
+              <w:t>10</w:t>
+            </w:r>
+            <w:r>
+              <w:rPr>
+                <w:rFonts w:asciiTheme="majorHAnsi" w:eastAsia="Times New Roman" w:hAnsiTheme="majorHAnsi" w:cstheme="majorHAnsi"/>
+                <w:sz w:val="24"/>
+                <w:szCs w:val="24"/>
+              </w:rPr>
+              <w:t>-24</w:t>
             </w:r>
           </w:p>
         </w:tc>

</xml_diff>